<commit_message>
Resim Eklenmesi Ve Duzenleme
</commit_message>
<xml_diff>
--- a/SENE ODEVİ RAPOR.docx
+++ b/SENE ODEVİ RAPOR.docx
@@ -1021,39 +1021,7 @@
         <w:pStyle w:val="GvdeMetni"/>
       </w:pPr>
       <w:r>
-        <w:t xml:space="preserve"> ✓ - </w:t>
-      </w:r>
-      <w:proofErr w:type="spellStart"/>
-      <w:r>
-        <w:t>Şifre</w:t>
-      </w:r>
-      <w:proofErr w:type="spellEnd"/>
-      <w:r>
-        <w:t xml:space="preserve"> </w:t>
-      </w:r>
-      <w:proofErr w:type="spellStart"/>
-      <w:r>
-        <w:t>hashlenmiş</w:t>
-      </w:r>
-      <w:proofErr w:type="spellEnd"/>
-      <w:r>
-        <w:t xml:space="preserve"> </w:t>
-      </w:r>
-      <w:proofErr w:type="spellStart"/>
-      <w:r>
-        <w:t>şekilde</w:t>
-      </w:r>
-      <w:proofErr w:type="spellEnd"/>
-      <w:r>
-        <w:t xml:space="preserve"> </w:t>
-      </w:r>
-      <w:proofErr w:type="spellStart"/>
-      <w:r>
-        <w:t>saklanıyor</w:t>
-      </w:r>
-      <w:proofErr w:type="spellEnd"/>
-      <w:r>
-        <w:t xml:space="preserve"> </w:t>
+        <w:t xml:space="preserve"> ✓ - Şifre hashlenmiş şekilde saklanıyor </w:t>
       </w:r>
     </w:p>
     <w:p>
@@ -1061,31 +1029,7 @@
         <w:pStyle w:val="GvdeMetni"/>
       </w:pPr>
       <w:r>
-        <w:t>✓</w:t>
-      </w:r>
-      <w:proofErr w:type="spellStart"/>
-      <w:r>
-        <w:t>Eksikler</w:t>
-      </w:r>
-      <w:proofErr w:type="spellEnd"/>
-      <w:r>
-        <w:t xml:space="preserve"> / </w:t>
-      </w:r>
-      <w:proofErr w:type="spellStart"/>
-      <w:r>
-        <w:t>Geliştirme</w:t>
-      </w:r>
-      <w:proofErr w:type="spellEnd"/>
-      <w:r>
-        <w:t xml:space="preserve"> </w:t>
-      </w:r>
-      <w:proofErr w:type="spellStart"/>
-      <w:r>
-        <w:t>Alanları</w:t>
-      </w:r>
-      <w:proofErr w:type="spellEnd"/>
-      <w:r>
-        <w:t>: - Admin modülü tamamlanmalı - Tema modülü tamamlanmalı</w:t>
+        <w:t>✓Eksikler / Geliştirme Alanları: - Admin modülü tamamlanmalı - Tema modülü tamamlanmalı</w:t>
       </w:r>
     </w:p>
     <w:p>
@@ -1101,74 +1045,16 @@
         <w:pStyle w:val="GvdeMetni"/>
       </w:pPr>
       <w:r>
-        <w:t xml:space="preserve">✔️ Frontend ve backend </w:t>
+        <w:t>✔️ Frontend ve backend bağlantısı hash sistemi ile uyumlu</w:t>
       </w:r>
-      <w:proofErr w:type="spellStart"/>
-      <w:r>
-        <w:t>bağlantısı</w:t>
-      </w:r>
-      <w:proofErr w:type="spellEnd"/>
-      <w:r>
-        <w:t xml:space="preserve"> hash </w:t>
-      </w:r>
-      <w:proofErr w:type="spellStart"/>
-      <w:r>
-        <w:t>sistemi</w:t>
-      </w:r>
-      <w:proofErr w:type="spellEnd"/>
-      <w:r>
-        <w:t xml:space="preserve"> </w:t>
-      </w:r>
-      <w:proofErr w:type="spellStart"/>
-      <w:r>
-        <w:t>ile</w:t>
-      </w:r>
-      <w:proofErr w:type="spellEnd"/>
-      <w:r>
-        <w:t xml:space="preserve"> </w:t>
-      </w:r>
-      <w:proofErr w:type="spellStart"/>
-      <w:r>
-        <w:t>uyumlu</w:t>
-      </w:r>
-      <w:proofErr w:type="spellEnd"/>
     </w:p>
     <w:p>
       <w:pPr>
         <w:pStyle w:val="GvdeMetni"/>
       </w:pPr>
       <w:r>
-        <w:t xml:space="preserve"> ✔️ Temel </w:t>
+        <w:t xml:space="preserve"> ✔️ Temel kullanıcı işlemleri çalışır durumda</w:t>
       </w:r>
-      <w:proofErr w:type="spellStart"/>
-      <w:r>
-        <w:t>kullanıcı</w:t>
-      </w:r>
-      <w:proofErr w:type="spellEnd"/>
-      <w:r>
-        <w:t xml:space="preserve"> </w:t>
-      </w:r>
-      <w:proofErr w:type="spellStart"/>
-      <w:r>
-        <w:t>işlemleri</w:t>
-      </w:r>
-      <w:proofErr w:type="spellEnd"/>
-      <w:r>
-        <w:t xml:space="preserve"> </w:t>
-      </w:r>
-      <w:proofErr w:type="spellStart"/>
-      <w:r>
-        <w:t>çalışır</w:t>
-      </w:r>
-      <w:proofErr w:type="spellEnd"/>
-      <w:r>
-        <w:t xml:space="preserve"> </w:t>
-      </w:r>
-      <w:proofErr w:type="spellStart"/>
-      <w:r>
-        <w:t>durumda</w:t>
-      </w:r>
-      <w:proofErr w:type="spellEnd"/>
     </w:p>
     <w:p>
       <w:pPr>
@@ -1228,6 +1114,18 @@
       </w:pPr>
       <w:r>
         <w:t>Tüm API endpoint’leri sunucuda test edilmiş ve çalışıyor</w:t>
+      </w:r>
+    </w:p>
+    <w:p>
+      <w:pPr>
+        <w:pStyle w:val="Compact"/>
+        <w:numPr>
+          <w:ilvl w:val="0"/>
+          <w:numId w:val="2"/>
+        </w:numPr>
+      </w:pPr>
+      <w:r>
+        <w:t>Manuel Olarak Çalışır halde</w:t>
       </w:r>
     </w:p>
     <w:p>

</xml_diff>

<commit_message>
Tema sistemi eklendi ve renk değişim altyapısı hazırlandı (CSS entegrasyonu yapılmadı)
</commit_message>
<xml_diff>
--- a/SENE ODEVİ RAPOR.docx
+++ b/SENE ODEVİ RAPOR.docx
@@ -76,13 +76,8 @@
       </w:r>
       <w:proofErr w:type="spellEnd"/>
       <w:r>
-        <w:t xml:space="preserve"> </w:t>
-      </w:r>
-      <w:proofErr w:type="spellStart"/>
-      <w:r>
-        <w:t>hazır</w:t>
-      </w:r>
-      <w:proofErr w:type="spellEnd"/>
+        <w:t xml:space="preserve"> hazır</w:t>
+      </w:r>
     </w:p>
     <w:p>
       <w:r>
@@ -132,7 +127,23 @@
     </w:p>
     <w:p>
       <w:r>
-        <w:t xml:space="preserve">Theme                | ✓    | ✓   | </w:t>
+        <w:t>Theme                | ✓    | ✓   |</w:t>
+      </w:r>
+      <w:r>
+        <w:t xml:space="preserve">✓  </w:t>
+      </w:r>
+      <w:r>
+        <w:t xml:space="preserve">      | </w:t>
+      </w:r>
+      <w:proofErr w:type="spellStart"/>
+      <w:r>
+        <w:t>Tamanlandı</w:t>
+      </w:r>
+      <w:proofErr w:type="spellEnd"/>
+    </w:p>
+    <w:p>
+      <w:r>
+        <w:t xml:space="preserve">Admin Login          | ✓    | ✓   | </w:t>
       </w:r>
       <w:r>
         <w:rPr>
@@ -141,25 +152,25 @@
         <w:t>⚠️</w:t>
       </w:r>
       <w:r>
-        <w:t xml:space="preserve">         | JS </w:t>
-      </w:r>
-      <w:proofErr w:type="spellStart"/>
-      <w:r>
-        <w:t>geliştirme</w:t>
-      </w:r>
-      <w:proofErr w:type="spellEnd"/>
-      <w:r>
-        <w:t xml:space="preserve"> </w:t>
-      </w:r>
-      <w:proofErr w:type="spellStart"/>
-      <w:r>
-        <w:t>aşamasında</w:t>
-      </w:r>
-      <w:proofErr w:type="spellEnd"/>
-    </w:p>
-    <w:p>
-      <w:r>
-        <w:t xml:space="preserve">Admin Login          | ✓    | ✓   | </w:t>
+        <w:t xml:space="preserve">         | Token + </w:t>
+      </w:r>
+      <w:proofErr w:type="spellStart"/>
+      <w:r>
+        <w:t>yetkilendirme</w:t>
+      </w:r>
+      <w:proofErr w:type="spellEnd"/>
+      <w:r>
+        <w:t xml:space="preserve"> </w:t>
+      </w:r>
+      <w:proofErr w:type="spellStart"/>
+      <w:r>
+        <w:t>eklenecek</w:t>
+      </w:r>
+      <w:proofErr w:type="spellEnd"/>
+    </w:p>
+    <w:p>
+      <w:r>
+        <w:t xml:space="preserve">Admin Operations     | ✓    | ✓   | </w:t>
       </w:r>
       <w:r>
         <w:rPr>
@@ -168,25 +179,48 @@
         <w:t>⚠️</w:t>
       </w:r>
       <w:r>
-        <w:t xml:space="preserve">         | Token + </w:t>
-      </w:r>
-      <w:proofErr w:type="spellStart"/>
-      <w:r>
-        <w:t>yetkilendirme</w:t>
-      </w:r>
-      <w:proofErr w:type="spellEnd"/>
-      <w:r>
-        <w:t xml:space="preserve"> </w:t>
-      </w:r>
-      <w:proofErr w:type="spellStart"/>
-      <w:r>
-        <w:t>eklenecek</w:t>
-      </w:r>
-      <w:proofErr w:type="spellEnd"/>
-    </w:p>
-    <w:p>
-      <w:r>
-        <w:t xml:space="preserve">Admin Operations     | ✓    | ✓   | </w:t>
+        <w:t xml:space="preserve">         | </w:t>
+      </w:r>
+      <w:proofErr w:type="spellStart"/>
+      <w:r>
+        <w:t>Geliştirme</w:t>
+      </w:r>
+      <w:proofErr w:type="spellEnd"/>
+      <w:r>
+        <w:t xml:space="preserve"> </w:t>
+      </w:r>
+      <w:proofErr w:type="spellStart"/>
+      <w:r>
+        <w:t>aşamasında</w:t>
+      </w:r>
+      <w:proofErr w:type="spellEnd"/>
+    </w:p>
+    <w:p>
+      <w:r>
+        <w:t xml:space="preserve">Password Update      | ✓    | ✓   | ✓          | Hash </w:t>
+      </w:r>
+      <w:proofErr w:type="spellStart"/>
+      <w:r>
+        <w:t>uyumlu</w:t>
+      </w:r>
+      <w:proofErr w:type="spellEnd"/>
+      <w:r>
+        <w:t xml:space="preserve"> </w:t>
+      </w:r>
+      <w:proofErr w:type="spellStart"/>
+      <w:r>
+        <w:t>çalışıyor</w:t>
+      </w:r>
+      <w:proofErr w:type="spellEnd"/>
+    </w:p>
+    <w:p>
+      <w:proofErr w:type="spellStart"/>
+      <w:r>
+        <w:t>Aboneliklerim</w:t>
+      </w:r>
+      <w:proofErr w:type="spellEnd"/>
+      <w:r>
+        <w:t xml:space="preserve">        | ✓    | ✓   | </w:t>
       </w:r>
       <w:r>
         <w:rPr>
@@ -199,56 +233,6 @@
       </w:r>
       <w:proofErr w:type="spellStart"/>
       <w:r>
-        <w:t>Geliştirme</w:t>
-      </w:r>
-      <w:proofErr w:type="spellEnd"/>
-      <w:r>
-        <w:t xml:space="preserve"> </w:t>
-      </w:r>
-      <w:proofErr w:type="spellStart"/>
-      <w:r>
-        <w:t>aşamasında</w:t>
-      </w:r>
-      <w:proofErr w:type="spellEnd"/>
-    </w:p>
-    <w:p>
-      <w:r>
-        <w:t xml:space="preserve">Password Update      | ✓    | ✓   | ✓          | Hash </w:t>
-      </w:r>
-      <w:proofErr w:type="spellStart"/>
-      <w:r>
-        <w:t>uyumlu</w:t>
-      </w:r>
-      <w:proofErr w:type="spellEnd"/>
-      <w:r>
-        <w:t xml:space="preserve"> </w:t>
-      </w:r>
-      <w:proofErr w:type="spellStart"/>
-      <w:r>
-        <w:t>çalışıyor</w:t>
-      </w:r>
-      <w:proofErr w:type="spellEnd"/>
-    </w:p>
-    <w:p>
-      <w:proofErr w:type="spellStart"/>
-      <w:r>
-        <w:t>Aboneliklerim</w:t>
-      </w:r>
-      <w:proofErr w:type="spellEnd"/>
-      <w:r>
-        <w:t xml:space="preserve">        | ✓    | ✓   | </w:t>
-      </w:r>
-      <w:r>
-        <w:rPr>
-          <w:rFonts w:ascii="Segoe UI Emoji" w:hAnsi="Segoe UI Emoji" w:cs="Segoe UI Emoji"/>
-        </w:rPr>
-        <w:t>⚠️</w:t>
-      </w:r>
-      <w:r>
-        <w:t xml:space="preserve">         | </w:t>
-      </w:r>
-      <w:proofErr w:type="spellStart"/>
-      <w:r>
         <w:t>Sayfa</w:t>
       </w:r>
       <w:proofErr w:type="spellEnd"/>
@@ -340,6 +324,32 @@
       </w:r>
       <w:proofErr w:type="spellEnd"/>
       <w:r>
+        <w:t xml:space="preserve"> şifre </w:t>
+      </w:r>
+      <w:proofErr w:type="spellStart"/>
+      <w:r>
+        <w:t>kontrolü</w:t>
+      </w:r>
+      <w:proofErr w:type="spellEnd"/>
+      <w:r>
+        <w:t xml:space="preserve"> </w:t>
+      </w:r>
+      <w:proofErr w:type="spellStart"/>
+      <w:r>
+        <w:t>aktif</w:t>
+      </w:r>
+      <w:proofErr w:type="spellEnd"/>
+    </w:p>
+    <w:p>
+      <w:r>
+        <w:t xml:space="preserve">Register        | </w:t>
+      </w:r>
+      <w:proofErr w:type="spellStart"/>
+      <w:r>
+        <w:t>Hashli</w:t>
+      </w:r>
+      <w:proofErr w:type="spellEnd"/>
+      <w:r>
         <w:t xml:space="preserve"> </w:t>
       </w:r>
       <w:proofErr w:type="spellStart"/>
@@ -352,6 +362,48 @@
       </w:r>
       <w:proofErr w:type="spellStart"/>
       <w:r>
+        <w:t>ile</w:t>
+      </w:r>
+      <w:proofErr w:type="spellEnd"/>
+      <w:r>
+        <w:t xml:space="preserve"> </w:t>
+      </w:r>
+      <w:proofErr w:type="spellStart"/>
+      <w:r>
+        <w:t>kayıt</w:t>
+      </w:r>
+      <w:proofErr w:type="spellEnd"/>
+      <w:r>
+        <w:t xml:space="preserve"> </w:t>
+      </w:r>
+      <w:proofErr w:type="spellStart"/>
+      <w:r>
+        <w:t>başarılı</w:t>
+      </w:r>
+      <w:proofErr w:type="spellEnd"/>
+    </w:p>
+    <w:p>
+      <w:r>
+        <w:t xml:space="preserve">Validation      | </w:t>
+      </w:r>
+      <w:proofErr w:type="spellStart"/>
+      <w:r>
+        <w:t>Zorunlu</w:t>
+      </w:r>
+      <w:proofErr w:type="spellEnd"/>
+      <w:r>
+        <w:t xml:space="preserve"> </w:t>
+      </w:r>
+      <w:proofErr w:type="spellStart"/>
+      <w:r>
+        <w:t>alan</w:t>
+      </w:r>
+      <w:proofErr w:type="spellEnd"/>
+      <w:r>
+        <w:t xml:space="preserve"> </w:t>
+      </w:r>
+      <w:proofErr w:type="spellStart"/>
+      <w:r>
         <w:t>kontrolü</w:t>
       </w:r>
       <w:proofErr w:type="spellEnd"/>
@@ -360,82 +412,6 @@
       </w:r>
       <w:proofErr w:type="spellStart"/>
       <w:r>
-        <w:t>aktif</w:t>
-      </w:r>
-      <w:proofErr w:type="spellEnd"/>
-    </w:p>
-    <w:p>
-      <w:r>
-        <w:t xml:space="preserve">Register        | </w:t>
-      </w:r>
-      <w:proofErr w:type="spellStart"/>
-      <w:r>
-        <w:t>Hashli</w:t>
-      </w:r>
-      <w:proofErr w:type="spellEnd"/>
-      <w:r>
-        <w:t xml:space="preserve"> </w:t>
-      </w:r>
-      <w:proofErr w:type="spellStart"/>
-      <w:r>
-        <w:t>şifre</w:t>
-      </w:r>
-      <w:proofErr w:type="spellEnd"/>
-      <w:r>
-        <w:t xml:space="preserve"> </w:t>
-      </w:r>
-      <w:proofErr w:type="spellStart"/>
-      <w:r>
-        <w:t>ile</w:t>
-      </w:r>
-      <w:proofErr w:type="spellEnd"/>
-      <w:r>
-        <w:t xml:space="preserve"> </w:t>
-      </w:r>
-      <w:proofErr w:type="spellStart"/>
-      <w:r>
-        <w:t>kayıt</w:t>
-      </w:r>
-      <w:proofErr w:type="spellEnd"/>
-      <w:r>
-        <w:t xml:space="preserve"> </w:t>
-      </w:r>
-      <w:proofErr w:type="spellStart"/>
-      <w:r>
-        <w:t>başarılı</w:t>
-      </w:r>
-      <w:proofErr w:type="spellEnd"/>
-    </w:p>
-    <w:p>
-      <w:r>
-        <w:t xml:space="preserve">Validation      | </w:t>
-      </w:r>
-      <w:proofErr w:type="spellStart"/>
-      <w:r>
-        <w:t>Zorunlu</w:t>
-      </w:r>
-      <w:proofErr w:type="spellEnd"/>
-      <w:r>
-        <w:t xml:space="preserve"> </w:t>
-      </w:r>
-      <w:proofErr w:type="spellStart"/>
-      <w:r>
-        <w:t>alan</w:t>
-      </w:r>
-      <w:proofErr w:type="spellEnd"/>
-      <w:r>
-        <w:t xml:space="preserve"> </w:t>
-      </w:r>
-      <w:proofErr w:type="spellStart"/>
-      <w:r>
-        <w:t>kontrolü</w:t>
-      </w:r>
-      <w:proofErr w:type="spellEnd"/>
-      <w:r>
-        <w:t xml:space="preserve"> </w:t>
-      </w:r>
-      <w:proofErr w:type="spellStart"/>
-      <w:r>
         <w:t>mevcut</w:t>
       </w:r>
       <w:proofErr w:type="spellEnd"/>
@@ -452,15 +428,7 @@
     </w:p>
     <w:p>
       <w:r>
-        <w:t xml:space="preserve">API / </w:t>
-      </w:r>
-      <w:proofErr w:type="gramStart"/>
-      <w:r>
-        <w:t>Endpoint  |</w:t>
-      </w:r>
-      <w:proofErr w:type="gramEnd"/>
-      <w:r>
-        <w:t xml:space="preserve"> Frontend </w:t>
+        <w:t xml:space="preserve">API / Endpoint  | Frontend </w:t>
       </w:r>
       <w:proofErr w:type="spellStart"/>
       <w:r>
@@ -1173,14 +1141,20 @@
         <w:rPr>
           <w:rFonts w:ascii="Segoe UI Emoji" w:hAnsi="Segoe UI Emoji" w:cs="Segoe UI Emoji"/>
         </w:rPr>
-        <w:t>⚠️</w:t>
-      </w:r>
-      <w:r>
-        <w:t xml:space="preserve"> JS </w:t>
-      </w:r>
-      <w:proofErr w:type="spellStart"/>
-      <w:r>
-        <w:t>eksik</w:t>
+        <w:t>✅</w:t>
+      </w:r>
+      <w:r>
+        <w:t xml:space="preserve"> </w:t>
+      </w:r>
+      <w:proofErr w:type="spellStart"/>
+      <w:r>
+        <w:t>Tamamland</w:t>
+      </w:r>
+      <w:r>
+        <w:rPr>
+          <w:rFonts w:ascii="Aptos" w:hAnsi="Aptos" w:cs="Aptos"/>
+        </w:rPr>
+        <w:t>ı</w:t>
       </w:r>
       <w:proofErr w:type="spellEnd"/>
     </w:p>
@@ -1367,77 +1341,6 @@
       <w:proofErr w:type="spellStart"/>
       <w:r>
         <w:t>işlemleri</w:t>
-      </w:r>
-      <w:proofErr w:type="spellEnd"/>
-    </w:p>
-    <w:p/>
-    <w:p>
-      <w:r>
-        <w:t xml:space="preserve">4. Theme </w:t>
-      </w:r>
-      <w:proofErr w:type="spellStart"/>
-      <w:r>
-        <w:t>Sistemi</w:t>
-      </w:r>
-      <w:proofErr w:type="spellEnd"/>
-    </w:p>
-    <w:p>
-      <w:r>
-        <w:t xml:space="preserve">- </w:t>
-      </w:r>
-      <w:proofErr w:type="spellStart"/>
-      <w:r>
-        <w:t>LocalStorage</w:t>
-      </w:r>
-      <w:proofErr w:type="spellEnd"/>
-      <w:r>
-        <w:t xml:space="preserve"> </w:t>
-      </w:r>
-      <w:proofErr w:type="spellStart"/>
-      <w:r>
-        <w:t>veya</w:t>
-      </w:r>
-      <w:proofErr w:type="spellEnd"/>
-      <w:r>
-        <w:t xml:space="preserve"> DB </w:t>
-      </w:r>
-      <w:proofErr w:type="spellStart"/>
-      <w:r>
-        <w:t>tabanlı</w:t>
-      </w:r>
-      <w:proofErr w:type="spellEnd"/>
-      <w:r>
-        <w:t xml:space="preserve"> </w:t>
-      </w:r>
-      <w:proofErr w:type="spellStart"/>
-      <w:r>
-        <w:t>tema</w:t>
-      </w:r>
-      <w:proofErr w:type="spellEnd"/>
-    </w:p>
-    <w:p>
-      <w:r>
-        <w:t xml:space="preserve">- </w:t>
-      </w:r>
-      <w:proofErr w:type="spellStart"/>
-      <w:r>
-        <w:t>Kullanıcıya</w:t>
-      </w:r>
-      <w:proofErr w:type="spellEnd"/>
-      <w:r>
-        <w:t xml:space="preserve"> </w:t>
-      </w:r>
-      <w:proofErr w:type="spellStart"/>
-      <w:r>
-        <w:t>özel</w:t>
-      </w:r>
-      <w:proofErr w:type="spellEnd"/>
-      <w:r>
-        <w:t xml:space="preserve"> </w:t>
-      </w:r>
-      <w:proofErr w:type="spellStart"/>
-      <w:r>
-        <w:t>tema</w:t>
       </w:r>
       <w:proofErr w:type="spellEnd"/>
     </w:p>

</xml_diff>